<commit_message>
docs: enhance platform documentation .docx — diagrams, ERD, workflows, packs, CTO summary
Adds 7 sections (21–27) to VANTORA_Full_Platform_Documentation.docx with embedded
visual diagrams generated via matplotlib (gen_diagrams.py → docs/diagrams/*.png):
- 21 Architecture diagram (governance→runtime control flow)
- 22 Database ERD overview (ownership chains, cardinalities)
- 23 Workflow maps (onboarding, user creation, role/plan assignment, module enablement,
  permission resolution, audit logging)
- 24 Module dependency map (+ dependency table)
- 25 Future industry packs (core/unique modules + target customer per pack)
- 26 Final architecture readiness assessment (scored bar chart + rationale table)
- 27 Executive CTO summary (what it is / complete / remains / next / pre-launch gates)

Table of contents updated to 27 sections. Document: ~621 KB, 28 headings, 15 tables,
5 embedded diagrams, ~17–19 pages. Verified valid + reopens cleanly.
</commit_message>
<xml_diff>
--- a/VANTORA_Full_Platform_Documentation.docx
+++ b/VANTORA_Full_Platform_Documentation.docx
@@ -234,6 +234,62 @@
           <w:sz w:val="21"/>
         </w:rPr>
         <w:t>20. Recommended Next Development Phase</w:t>
+      </w:r>
+    </w:p>
+    <w:p>
+      <w:r>
+        <w:rPr>
+          <w:sz w:val="21"/>
+        </w:rPr>
+        <w:t>21. Architecture Diagram</w:t>
+      </w:r>
+    </w:p>
+    <w:p>
+      <w:r>
+        <w:rPr>
+          <w:sz w:val="21"/>
+        </w:rPr>
+        <w:t>22. Database ERD Overview</w:t>
+      </w:r>
+    </w:p>
+    <w:p>
+      <w:r>
+        <w:rPr>
+          <w:sz w:val="21"/>
+        </w:rPr>
+        <w:t>23. Workflow Maps</w:t>
+      </w:r>
+    </w:p>
+    <w:p>
+      <w:r>
+        <w:rPr>
+          <w:sz w:val="21"/>
+        </w:rPr>
+        <w:t>24. Module Dependency Map</w:t>
+      </w:r>
+    </w:p>
+    <w:p>
+      <w:r>
+        <w:rPr>
+          <w:sz w:val="21"/>
+        </w:rPr>
+        <w:t>25. Future Industry Packs</w:t>
+      </w:r>
+    </w:p>
+    <w:p>
+      <w:r>
+        <w:rPr>
+          <w:sz w:val="21"/>
+        </w:rPr>
+        <w:t>26. Final Architecture Readiness Assessment</w:t>
+      </w:r>
+    </w:p>
+    <w:p>
+      <w:r>
+        <w:rPr>
+          <w:sz w:val="21"/>
+        </w:rPr>
+        <w:t>27. Executive CTO Summary</w:t>
       </w:r>
     </w:p>
     <w:p>
@@ -5550,6 +5606,2013 @@
       </w:tr>
     </w:tbl>
     <w:p/>
+    <w:p>
+      <w:r>
+        <w:br w:type="page"/>
+      </w:r>
+    </w:p>
+    <w:p>
+      <w:pPr>
+        <w:pStyle w:val="Heading1"/>
+      </w:pPr>
+      <w:r>
+        <w:t>21. Architecture Diagram</w:t>
+      </w:r>
+    </w:p>
+    <w:p>
+      <w:r>
+        <w:rPr>
+          <w:b w:val="0"/>
+          <w:i w:val="0"/>
+        </w:rPr>
+        <w:t>The diagram below shows VANTORA’s governance-to-runtime control flow. The Platform Owner defines plans, modules, roles, and permissions (governance); companies and their users then operate strictly within those entitlements (runtime); and Row-Level Security enforces tenant isolation at the database — the hard boundary that one tenant can never cross into another.</w:t>
+      </w:r>
+    </w:p>
+    <w:p>
+      <w:pPr>
+        <w:jc w:val="center"/>
+      </w:pPr>
+      <w:r>
+        <w:drawing>
+          <wp:inline xmlns:a="http://schemas.openxmlformats.org/drawingml/2006/main" xmlns:pic="http://schemas.openxmlformats.org/drawingml/2006/picture">
+            <wp:extent cx="4297680" cy="5730240"/>
+            <wp:docPr id="1" name="Picture 1"/>
+            <wp:cNvGraphicFramePr>
+              <a:graphicFrameLocks noChangeAspect="1"/>
+            </wp:cNvGraphicFramePr>
+            <a:graphic>
+              <a:graphicData uri="http://schemas.openxmlformats.org/drawingml/2006/picture">
+                <pic:pic>
+                  <pic:nvPicPr>
+                    <pic:cNvPr id="0" name="arch.png"/>
+                    <pic:cNvPicPr/>
+                  </pic:nvPicPr>
+                  <pic:blipFill>
+                    <a:blip r:embed="rId9"/>
+                    <a:stretch>
+                      <a:fillRect/>
+                    </a:stretch>
+                  </pic:blipFill>
+                  <pic:spPr>
+                    <a:xfrm>
+                      <a:off x="0" y="0"/>
+                      <a:ext cx="4297680" cy="5730240"/>
+                    </a:xfrm>
+                    <a:prstGeom prst="rect"/>
+                  </pic:spPr>
+                </pic:pic>
+              </a:graphicData>
+            </a:graphic>
+          </wp:inline>
+        </w:drawing>
+      </w:r>
+    </w:p>
+    <w:p>
+      <w:pPr>
+        <w:jc w:val="center"/>
+      </w:pPr>
+      <w:r>
+        <w:rPr>
+          <w:i/>
+          <w:color w:val="666666"/>
+          <w:sz w:val="17"/>
+        </w:rPr>
+        <w:t>Figure 1 — Governance &amp; control flow: vendor defines → runtime enforces.</w:t>
+      </w:r>
+    </w:p>
+    <w:p/>
+    <w:p>
+      <w:r>
+        <w:br w:type="page"/>
+      </w:r>
+    </w:p>
+    <w:p>
+      <w:pPr>
+        <w:pStyle w:val="Heading1"/>
+      </w:pPr>
+      <w:r>
+        <w:t>22. Database ERD Overview</w:t>
+      </w:r>
+    </w:p>
+    <w:p>
+      <w:r>
+        <w:rPr>
+          <w:b w:val="0"/>
+          <w:i w:val="0"/>
+        </w:rPr>
+        <w:t>A high-level view of the core entities and their ownership chains. COMPANIES is the tenancy hub: every operational record ultimately traces back to a company, which is the basis for Row-Level Security. Cardinalities use 1—* (one-to-many) and *—* (many-to-many via a link table).</w:t>
+      </w:r>
+    </w:p>
+    <w:p>
+      <w:pPr>
+        <w:jc w:val="center"/>
+      </w:pPr>
+      <w:r>
+        <w:drawing>
+          <wp:inline xmlns:a="http://schemas.openxmlformats.org/drawingml/2006/main" xmlns:pic="http://schemas.openxmlformats.org/drawingml/2006/picture">
+            <wp:extent cx="5943600" cy="4657376"/>
+            <wp:docPr id="2" name="Picture 2"/>
+            <wp:cNvGraphicFramePr>
+              <a:graphicFrameLocks noChangeAspect="1"/>
+            </wp:cNvGraphicFramePr>
+            <a:graphic>
+              <a:graphicData uri="http://schemas.openxmlformats.org/drawingml/2006/picture">
+                <pic:pic>
+                  <pic:nvPicPr>
+                    <pic:cNvPr id="0" name="erd.png"/>
+                    <pic:cNvPicPr/>
+                  </pic:nvPicPr>
+                  <pic:blipFill>
+                    <a:blip r:embed="rId10"/>
+                    <a:stretch>
+                      <a:fillRect/>
+                    </a:stretch>
+                  </pic:blipFill>
+                  <pic:spPr>
+                    <a:xfrm>
+                      <a:off x="0" y="0"/>
+                      <a:ext cx="5943600" cy="4657376"/>
+                    </a:xfrm>
+                    <a:prstGeom prst="rect"/>
+                  </pic:spPr>
+                </pic:pic>
+              </a:graphicData>
+            </a:graphic>
+          </wp:inline>
+        </w:drawing>
+      </w:r>
+    </w:p>
+    <w:p>
+      <w:pPr>
+        <w:jc w:val="center"/>
+      </w:pPr>
+      <w:r>
+        <w:rPr>
+          <w:i/>
+          <w:color w:val="666666"/>
+          <w:sz w:val="17"/>
+        </w:rPr>
+        <w:t>Figure 2 — Entity relationship overview (ownership chains).</w:t>
+      </w:r>
+    </w:p>
+    <w:p/>
+    <w:p>
+      <w:r>
+        <w:rPr>
+          <w:b/>
+          <w:i w:val="0"/>
+        </w:rPr>
+        <w:t>Primary ownership chains:</w:t>
+      </w:r>
+    </w:p>
+    <w:p>
+      <w:pPr>
+        <w:pStyle w:val="ListBullet"/>
+      </w:pPr>
+      <w:r>
+        <w:t>Company → Branches → Users (a user’s role is assigned per branch via erp_user_branches).</w:t>
+      </w:r>
+    </w:p>
+    <w:p>
+      <w:pPr>
+        <w:pStyle w:val="ListBullet"/>
+      </w:pPr>
+      <w:r>
+        <w:t>Plan → Company; Plan ⇄ Modules and Company ⇄ Modules → effective modules = the intersection.</w:t>
+      </w:r>
+    </w:p>
+    <w:p>
+      <w:pPr>
+        <w:pStyle w:val="ListBullet"/>
+      </w:pPr>
+      <w:r>
+        <w:t>Company → Roles ⇄ Permissions (company-scoped config, falling back to global defaults).</w:t>
+      </w:r>
+    </w:p>
+    <w:p>
+      <w:pPr>
+        <w:pStyle w:val="ListBullet"/>
+      </w:pPr>
+      <w:r>
+        <w:t>Company → Customers / Suppliers / Products; Customer → Invoices; Product ⇄ Invoice lines; Product → Inventory.</w:t>
+      </w:r>
+    </w:p>
+    <w:p>
+      <w:pPr>
+        <w:pStyle w:val="ListBullet"/>
+      </w:pPr>
+      <w:r>
+        <w:t>Company → Audit Logs; Company → Billing (subscriptions, invoices, payments).</w:t>
+      </w:r>
+    </w:p>
+    <w:p>
+      <w:r>
+        <w:br w:type="page"/>
+      </w:r>
+    </w:p>
+    <w:p>
+      <w:pPr>
+        <w:pStyle w:val="Heading1"/>
+      </w:pPr>
+      <w:r>
+        <w:t>23. Workflow Maps</w:t>
+      </w:r>
+    </w:p>
+    <w:p>
+      <w:r>
+        <w:rPr>
+          <w:b w:val="0"/>
+          <w:i w:val="0"/>
+        </w:rPr>
+        <w:t>Operational flows for the platform’s most important processes — onboarding, identity, entitlement, and governance.</w:t>
+      </w:r>
+    </w:p>
+    <w:p>
+      <w:pPr>
+        <w:jc w:val="center"/>
+      </w:pPr>
+      <w:r>
+        <w:drawing>
+          <wp:inline xmlns:a="http://schemas.openxmlformats.org/drawingml/2006/main" xmlns:pic="http://schemas.openxmlformats.org/drawingml/2006/picture">
+            <wp:extent cx="5852160" cy="7104474"/>
+            <wp:docPr id="3" name="Picture 3"/>
+            <wp:cNvGraphicFramePr>
+              <a:graphicFrameLocks noChangeAspect="1"/>
+            </wp:cNvGraphicFramePr>
+            <a:graphic>
+              <a:graphicData uri="http://schemas.openxmlformats.org/drawingml/2006/picture">
+                <pic:pic>
+                  <pic:nvPicPr>
+                    <pic:cNvPr id="0" name="workflows.png"/>
+                    <pic:cNvPicPr/>
+                  </pic:nvPicPr>
+                  <pic:blipFill>
+                    <a:blip r:embed="rId11"/>
+                    <a:stretch>
+                      <a:fillRect/>
+                    </a:stretch>
+                  </pic:blipFill>
+                  <pic:spPr>
+                    <a:xfrm>
+                      <a:off x="0" y="0"/>
+                      <a:ext cx="5852160" cy="7104474"/>
+                    </a:xfrm>
+                    <a:prstGeom prst="rect"/>
+                  </pic:spPr>
+                </pic:pic>
+              </a:graphicData>
+            </a:graphic>
+          </wp:inline>
+        </w:drawing>
+      </w:r>
+    </w:p>
+    <w:p>
+      <w:pPr>
+        <w:jc w:val="center"/>
+      </w:pPr>
+      <w:r>
+        <w:rPr>
+          <w:i/>
+          <w:color w:val="666666"/>
+          <w:sz w:val="17"/>
+        </w:rPr>
+        <w:t>Figure 3 — Operational workflow maps (seven flows).</w:t>
+      </w:r>
+    </w:p>
+    <w:p/>
+    <w:p>
+      <w:r>
+        <w:br w:type="page"/>
+      </w:r>
+    </w:p>
+    <w:p>
+      <w:pPr>
+        <w:pStyle w:val="Heading1"/>
+      </w:pPr>
+      <w:r>
+        <w:t>24. Module Dependency Map</w:t>
+      </w:r>
+    </w:p>
+    <w:p>
+      <w:r>
+        <w:rPr>
+          <w:b w:val="0"/>
+          <w:i w:val="0"/>
+        </w:rPr>
+        <w:t>Modules build on shared capabilities. "Depends on" means a module needs — or works best alongside — another to function. Core capabilities (shown in cyan) are the foundation; industry verticals and item-level refinements layer on top. The advisory dependency hints also drive UI warnings before a depended-on module is disabled.</w:t>
+      </w:r>
+    </w:p>
+    <w:p>
+      <w:pPr>
+        <w:jc w:val="center"/>
+      </w:pPr>
+      <w:r>
+        <w:drawing>
+          <wp:inline xmlns:a="http://schemas.openxmlformats.org/drawingml/2006/main" xmlns:pic="http://schemas.openxmlformats.org/drawingml/2006/picture">
+            <wp:extent cx="5852160" cy="4458789"/>
+            <wp:docPr id="4" name="Picture 4"/>
+            <wp:cNvGraphicFramePr>
+              <a:graphicFrameLocks noChangeAspect="1"/>
+            </wp:cNvGraphicFramePr>
+            <a:graphic>
+              <a:graphicData uri="http://schemas.openxmlformats.org/drawingml/2006/picture">
+                <pic:pic>
+                  <pic:nvPicPr>
+                    <pic:cNvPr id="0" name="deps.png"/>
+                    <pic:cNvPicPr/>
+                  </pic:nvPicPr>
+                  <pic:blipFill>
+                    <a:blip r:embed="rId12"/>
+                    <a:stretch>
+                      <a:fillRect/>
+                    </a:stretch>
+                  </pic:blipFill>
+                  <pic:spPr>
+                    <a:xfrm>
+                      <a:off x="0" y="0"/>
+                      <a:ext cx="5852160" cy="4458789"/>
+                    </a:xfrm>
+                    <a:prstGeom prst="rect"/>
+                  </pic:spPr>
+                </pic:pic>
+              </a:graphicData>
+            </a:graphic>
+          </wp:inline>
+        </w:drawing>
+      </w:r>
+    </w:p>
+    <w:p>
+      <w:pPr>
+        <w:jc w:val="center"/>
+      </w:pPr>
+      <w:r>
+        <w:rPr>
+          <w:i/>
+          <w:color w:val="666666"/>
+          <w:sz w:val="17"/>
+        </w:rPr>
+        <w:t>Figure 4 — Module dependency map.</w:t>
+      </w:r>
+    </w:p>
+    <w:p/>
+    <w:tbl>
+      <w:tblPr>
+        <w:tblStyle w:val="TableGrid"/>
+        <w:tblW w:type="auto" w:w="0"/>
+        <w:jc w:val="center"/>
+        <w:tblLook w:firstColumn="1" w:firstRow="1" w:lastColumn="0" w:lastRow="0" w:noHBand="0" w:noVBand="1" w:val="04A0"/>
+      </w:tblPr>
+      <w:tblGrid>
+        <w:gridCol w:w="4320"/>
+        <w:gridCol w:w="4320"/>
+      </w:tblGrid>
+      <w:tr>
+        <w:tc>
+          <w:tcPr>
+            <w:tcW w:type="dxa" w:w="2736"/>
+            <w:shd w:val="clear" w:fill="1F3A5F"/>
+          </w:tcPr>
+          <w:p>
+            <w:r/>
+            <w:r>
+              <w:rPr>
+                <w:b/>
+                <w:color w:val="FFFFFF"/>
+                <w:sz w:val="19"/>
+              </w:rPr>
+              <w:t>Module</w:t>
+            </w:r>
+          </w:p>
+        </w:tc>
+        <w:tc>
+          <w:tcPr>
+            <w:tcW w:type="dxa" w:w="6624"/>
+            <w:shd w:val="clear" w:fill="1F3A5F"/>
+          </w:tcPr>
+          <w:p>
+            <w:r/>
+            <w:r>
+              <w:rPr>
+                <w:b/>
+                <w:color w:val="FFFFFF"/>
+                <w:sz w:val="19"/>
+              </w:rPr>
+              <w:t>Depends on / works best with</w:t>
+            </w:r>
+          </w:p>
+        </w:tc>
+      </w:tr>
+      <w:tr>
+        <w:tc>
+          <w:tcPr>
+            <w:tcW w:type="dxa" w:w="2736"/>
+          </w:tcPr>
+          <w:p>
+            <w:r/>
+            <w:r>
+              <w:rPr>
+                <w:sz w:val="18"/>
+              </w:rPr>
+              <w:t>sales (core)</w:t>
+            </w:r>
+          </w:p>
+        </w:tc>
+        <w:tc>
+          <w:tcPr>
+            <w:tcW w:type="dxa" w:w="6624"/>
+          </w:tcPr>
+          <w:p>
+            <w:r/>
+            <w:r>
+              <w:rPr>
+                <w:sz w:val="18"/>
+              </w:rPr>
+              <w:t>customers, products, inventory, accounting (revenue posting)</w:t>
+            </w:r>
+          </w:p>
+        </w:tc>
+      </w:tr>
+      <w:tr>
+        <w:tc>
+          <w:tcPr>
+            <w:tcW w:type="dxa" w:w="2736"/>
+          </w:tcPr>
+          <w:p>
+            <w:r/>
+            <w:r>
+              <w:rPr>
+                <w:sz w:val="18"/>
+              </w:rPr>
+              <w:t>pos</w:t>
+            </w:r>
+          </w:p>
+        </w:tc>
+        <w:tc>
+          <w:tcPr>
+            <w:tcW w:type="dxa" w:w="6624"/>
+          </w:tcPr>
+          <w:p>
+            <w:r/>
+            <w:r>
+              <w:rPr>
+                <w:sz w:val="18"/>
+              </w:rPr>
+              <w:t>sales, inventory</w:t>
+            </w:r>
+          </w:p>
+        </w:tc>
+      </w:tr>
+      <w:tr>
+        <w:tc>
+          <w:tcPr>
+            <w:tcW w:type="dxa" w:w="2736"/>
+          </w:tcPr>
+          <w:p>
+            <w:r/>
+            <w:r>
+              <w:rPr>
+                <w:sz w:val="18"/>
+              </w:rPr>
+              <w:t>sales_orders / returns</w:t>
+            </w:r>
+          </w:p>
+        </w:tc>
+        <w:tc>
+          <w:tcPr>
+            <w:tcW w:type="dxa" w:w="6624"/>
+          </w:tcPr>
+          <w:p>
+            <w:r/>
+            <w:r>
+              <w:rPr>
+                <w:sz w:val="18"/>
+              </w:rPr>
+              <w:t>sales</w:t>
+            </w:r>
+          </w:p>
+        </w:tc>
+      </w:tr>
+      <w:tr>
+        <w:tc>
+          <w:tcPr>
+            <w:tcW w:type="dxa" w:w="2736"/>
+          </w:tcPr>
+          <w:p>
+            <w:r/>
+            <w:r>
+              <w:rPr>
+                <w:sz w:val="18"/>
+              </w:rPr>
+              <w:t>warehousing</w:t>
+            </w:r>
+          </w:p>
+        </w:tc>
+        <w:tc>
+          <w:tcPr>
+            <w:tcW w:type="dxa" w:w="6624"/>
+          </w:tcPr>
+          <w:p>
+            <w:r/>
+            <w:r>
+              <w:rPr>
+                <w:sz w:val="18"/>
+              </w:rPr>
+              <w:t>inventory</w:t>
+            </w:r>
+          </w:p>
+        </w:tc>
+      </w:tr>
+      <w:tr>
+        <w:tc>
+          <w:tcPr>
+            <w:tcW w:type="dxa" w:w="2736"/>
+          </w:tcPr>
+          <w:p>
+            <w:r/>
+            <w:r>
+              <w:rPr>
+                <w:sz w:val="18"/>
+              </w:rPr>
+              <w:t>market (supermarket)</w:t>
+            </w:r>
+          </w:p>
+        </w:tc>
+        <w:tc>
+          <w:tcPr>
+            <w:tcW w:type="dxa" w:w="6624"/>
+          </w:tcPr>
+          <w:p>
+            <w:r/>
+            <w:r>
+              <w:rPr>
+                <w:sz w:val="18"/>
+              </w:rPr>
+              <w:t>sales, inventory</w:t>
+            </w:r>
+          </w:p>
+        </w:tc>
+      </w:tr>
+      <w:tr>
+        <w:tc>
+          <w:tcPr>
+            <w:tcW w:type="dxa" w:w="2736"/>
+          </w:tcPr>
+          <w:p>
+            <w:r/>
+            <w:r>
+              <w:rPr>
+                <w:sz w:val="18"/>
+              </w:rPr>
+              <w:t>wholesale</w:t>
+            </w:r>
+          </w:p>
+        </w:tc>
+        <w:tc>
+          <w:tcPr>
+            <w:tcW w:type="dxa" w:w="6624"/>
+          </w:tcPr>
+          <w:p>
+            <w:r/>
+            <w:r>
+              <w:rPr>
+                <w:sz w:val="18"/>
+              </w:rPr>
+              <w:t>sales (price tiers)</w:t>
+            </w:r>
+          </w:p>
+        </w:tc>
+      </w:tr>
+      <w:tr>
+        <w:tc>
+          <w:tcPr>
+            <w:tcW w:type="dxa" w:w="2736"/>
+          </w:tcPr>
+          <w:p>
+            <w:r/>
+            <w:r>
+              <w:rPr>
+                <w:sz w:val="18"/>
+              </w:rPr>
+              <w:t>restaurant</w:t>
+            </w:r>
+          </w:p>
+        </w:tc>
+        <w:tc>
+          <w:tcPr>
+            <w:tcW w:type="dxa" w:w="6624"/>
+          </w:tcPr>
+          <w:p>
+            <w:r/>
+            <w:r>
+              <w:rPr>
+                <w:sz w:val="18"/>
+              </w:rPr>
+              <w:t>sales</w:t>
+            </w:r>
+          </w:p>
+        </w:tc>
+      </w:tr>
+      <w:tr>
+        <w:tc>
+          <w:tcPr>
+            <w:tcW w:type="dxa" w:w="2736"/>
+          </w:tcPr>
+          <w:p>
+            <w:r/>
+            <w:r>
+              <w:rPr>
+                <w:sz w:val="18"/>
+              </w:rPr>
+              <w:t>distribution</w:t>
+            </w:r>
+          </w:p>
+        </w:tc>
+        <w:tc>
+          <w:tcPr>
+            <w:tcW w:type="dxa" w:w="6624"/>
+          </w:tcPr>
+          <w:p>
+            <w:r/>
+            <w:r>
+              <w:rPr>
+                <w:sz w:val="18"/>
+              </w:rPr>
+              <w:t>sales, field_ops (journey planning, MSL / trade-marketing, perfect-store)</w:t>
+            </w:r>
+          </w:p>
+        </w:tc>
+      </w:tr>
+      <w:tr>
+        <w:tc>
+          <w:tcPr>
+            <w:tcW w:type="dxa" w:w="2736"/>
+          </w:tcPr>
+          <w:p>
+            <w:r/>
+            <w:r>
+              <w:rPr>
+                <w:sz w:val="18"/>
+              </w:rPr>
+              <w:t>fashion</w:t>
+            </w:r>
+          </w:p>
+        </w:tc>
+        <w:tc>
+          <w:tcPr>
+            <w:tcW w:type="dxa" w:w="6624"/>
+          </w:tcPr>
+          <w:p>
+            <w:r/>
+            <w:r>
+              <w:rPr>
+                <w:sz w:val="18"/>
+              </w:rPr>
+              <w:t>sales, inventory (+ installments &amp; cash box as built-in sub-features)</w:t>
+            </w:r>
+          </w:p>
+        </w:tc>
+      </w:tr>
+    </w:tbl>
+    <w:p/>
+    <w:p>
+      <w:r>
+        <w:br w:type="page"/>
+      </w:r>
+    </w:p>
+    <w:p>
+      <w:pPr>
+        <w:pStyle w:val="Heading1"/>
+      </w:pPr>
+      <w:r>
+        <w:t>25. Future Industry Packs</w:t>
+      </w:r>
+    </w:p>
+    <w:p>
+      <w:r>
+        <w:rPr>
+          <w:b w:val="0"/>
+          <w:i w:val="0"/>
+        </w:rPr>
+        <w:t>VANTORA’s pack model layers industry-specific modules on the shared commerce/accounting foundation. The packs below are built or planned; each lists the core modules it reuses, the modules/features unique to it, and its target customer profile.</w:t>
+      </w:r>
+    </w:p>
+    <w:tbl>
+      <w:tblPr>
+        <w:tblStyle w:val="TableGrid"/>
+        <w:tblW w:type="auto" w:w="0"/>
+        <w:jc w:val="center"/>
+        <w:tblLook w:firstColumn="1" w:firstRow="1" w:lastColumn="0" w:lastRow="0" w:noHBand="0" w:noVBand="1" w:val="04A0"/>
+      </w:tblPr>
+      <w:tblGrid>
+        <w:gridCol w:w="2160"/>
+        <w:gridCol w:w="2160"/>
+        <w:gridCol w:w="2160"/>
+        <w:gridCol w:w="2160"/>
+      </w:tblGrid>
+      <w:tr>
+        <w:tc>
+          <w:tcPr>
+            <w:tcW w:type="dxa" w:w="2016"/>
+            <w:shd w:val="clear" w:fill="1F3A5F"/>
+          </w:tcPr>
+          <w:p>
+            <w:r/>
+            <w:r>
+              <w:rPr>
+                <w:b/>
+                <w:color w:val="FFFFFF"/>
+                <w:sz w:val="19"/>
+              </w:rPr>
+              <w:t>Pack</w:t>
+            </w:r>
+          </w:p>
+        </w:tc>
+        <w:tc>
+          <w:tcPr>
+            <w:tcW w:type="dxa" w:w="2448"/>
+            <w:shd w:val="clear" w:fill="1F3A5F"/>
+          </w:tcPr>
+          <w:p>
+            <w:r/>
+            <w:r>
+              <w:rPr>
+                <w:b/>
+                <w:color w:val="FFFFFF"/>
+                <w:sz w:val="19"/>
+              </w:rPr>
+              <w:t>Core modules used</w:t>
+            </w:r>
+          </w:p>
+        </w:tc>
+        <w:tc>
+          <w:tcPr>
+            <w:tcW w:type="dxa" w:w="2880"/>
+            <w:shd w:val="clear" w:fill="1F3A5F"/>
+          </w:tcPr>
+          <w:p>
+            <w:r/>
+            <w:r>
+              <w:rPr>
+                <w:b/>
+                <w:color w:val="FFFFFF"/>
+                <w:sz w:val="19"/>
+              </w:rPr>
+              <w:t>Unique modules / features</w:t>
+            </w:r>
+          </w:p>
+        </w:tc>
+        <w:tc>
+          <w:tcPr>
+            <w:tcW w:type="dxa" w:w="2304"/>
+            <w:shd w:val="clear" w:fill="1F3A5F"/>
+          </w:tcPr>
+          <w:p>
+            <w:r/>
+            <w:r>
+              <w:rPr>
+                <w:b/>
+                <w:color w:val="FFFFFF"/>
+                <w:sz w:val="19"/>
+              </w:rPr>
+              <w:t>Target customer</w:t>
+            </w:r>
+          </w:p>
+        </w:tc>
+      </w:tr>
+      <w:tr>
+        <w:tc>
+          <w:tcPr>
+            <w:tcW w:type="dxa" w:w="2016"/>
+          </w:tcPr>
+          <w:p>
+            <w:r/>
+            <w:r>
+              <w:rPr>
+                <w:sz w:val="18"/>
+              </w:rPr>
+              <w:t>FMCG Distribution</w:t>
+            </w:r>
+          </w:p>
+        </w:tc>
+        <w:tc>
+          <w:tcPr>
+            <w:tcW w:type="dxa" w:w="2448"/>
+          </w:tcPr>
+          <w:p>
+            <w:r/>
+            <w:r>
+              <w:rPr>
+                <w:sz w:val="18"/>
+              </w:rPr>
+              <w:t>sales, inventory, accounting, field_ops</w:t>
+            </w:r>
+          </w:p>
+        </w:tc>
+        <w:tc>
+          <w:tcPr>
+            <w:tcW w:type="dxa" w:w="2880"/>
+          </w:tcPr>
+          <w:p>
+            <w:r/>
+            <w:r>
+              <w:rPr>
+                <w:sz w:val="18"/>
+              </w:rPr>
+              <w:t>routes, journey compliance, MSL matrix, perfect-store, outlet grading</w:t>
+            </w:r>
+          </w:p>
+        </w:tc>
+        <w:tc>
+          <w:tcPr>
+            <w:tcW w:type="dxa" w:w="2304"/>
+          </w:tcPr>
+          <w:p>
+            <w:r/>
+            <w:r>
+              <w:rPr>
+                <w:sz w:val="18"/>
+              </w:rPr>
+              <w:t>Distributors / wholesalers with van sales &amp; retail execution</w:t>
+            </w:r>
+          </w:p>
+        </w:tc>
+      </w:tr>
+      <w:tr>
+        <w:tc>
+          <w:tcPr>
+            <w:tcW w:type="dxa" w:w="2016"/>
+          </w:tcPr>
+          <w:p>
+            <w:r/>
+            <w:r>
+              <w:rPr>
+                <w:sz w:val="18"/>
+              </w:rPr>
+              <w:t>Clinic</w:t>
+            </w:r>
+          </w:p>
+        </w:tc>
+        <w:tc>
+          <w:tcPr>
+            <w:tcW w:type="dxa" w:w="2448"/>
+          </w:tcPr>
+          <w:p>
+            <w:r/>
+            <w:r>
+              <w:rPr>
+                <w:sz w:val="18"/>
+              </w:rPr>
+              <w:t>crm, sales, accounting</w:t>
+            </w:r>
+          </w:p>
+        </w:tc>
+        <w:tc>
+          <w:tcPr>
+            <w:tcW w:type="dxa" w:w="2880"/>
+          </w:tcPr>
+          <w:p>
+            <w:r/>
+            <w:r>
+              <w:rPr>
+                <w:sz w:val="18"/>
+              </w:rPr>
+              <w:t>reception, doctor queue, appointments, patients, visits, services, drug reference</w:t>
+            </w:r>
+          </w:p>
+        </w:tc>
+        <w:tc>
+          <w:tcPr>
+            <w:tcW w:type="dxa" w:w="2304"/>
+          </w:tcPr>
+          <w:p>
+            <w:r/>
+            <w:r>
+              <w:rPr>
+                <w:sz w:val="18"/>
+              </w:rPr>
+              <w:t>Clinics &amp; polyclinics</w:t>
+            </w:r>
+          </w:p>
+        </w:tc>
+      </w:tr>
+      <w:tr>
+        <w:tc>
+          <w:tcPr>
+            <w:tcW w:type="dxa" w:w="2016"/>
+          </w:tcPr>
+          <w:p>
+            <w:r/>
+            <w:r>
+              <w:rPr>
+                <w:sz w:val="18"/>
+              </w:rPr>
+              <w:t>Pharmacy</w:t>
+            </w:r>
+          </w:p>
+        </w:tc>
+        <w:tc>
+          <w:tcPr>
+            <w:tcW w:type="dxa" w:w="2448"/>
+          </w:tcPr>
+          <w:p>
+            <w:r/>
+            <w:r>
+              <w:rPr>
+                <w:sz w:val="18"/>
+              </w:rPr>
+              <w:t>sales, inventory, purchasing, accounting, pos</w:t>
+            </w:r>
+          </w:p>
+        </w:tc>
+        <w:tc>
+          <w:tcPr>
+            <w:tcW w:type="dxa" w:w="2880"/>
+          </w:tcPr>
+          <w:p>
+            <w:r/>
+            <w:r>
+              <w:rPr>
+                <w:sz w:val="18"/>
+              </w:rPr>
+              <w:t>dispensing, near-expiry tracking</w:t>
+            </w:r>
+          </w:p>
+        </w:tc>
+        <w:tc>
+          <w:tcPr>
+            <w:tcW w:type="dxa" w:w="2304"/>
+          </w:tcPr>
+          <w:p>
+            <w:r/>
+            <w:r>
+              <w:rPr>
+                <w:sz w:val="18"/>
+              </w:rPr>
+              <w:t>Pharmacies / drugstores</w:t>
+            </w:r>
+          </w:p>
+        </w:tc>
+      </w:tr>
+      <w:tr>
+        <w:tc>
+          <w:tcPr>
+            <w:tcW w:type="dxa" w:w="2016"/>
+          </w:tcPr>
+          <w:p>
+            <w:r/>
+            <w:r>
+              <w:rPr>
+                <w:sz w:val="18"/>
+              </w:rPr>
+              <w:t>Restaurant</w:t>
+            </w:r>
+          </w:p>
+        </w:tc>
+        <w:tc>
+          <w:tcPr>
+            <w:tcW w:type="dxa" w:w="2448"/>
+          </w:tcPr>
+          <w:p>
+            <w:r/>
+            <w:r>
+              <w:rPr>
+                <w:sz w:val="18"/>
+              </w:rPr>
+              <w:t>sales, inventory, accounting</w:t>
+            </w:r>
+          </w:p>
+        </w:tc>
+        <w:tc>
+          <w:tcPr>
+            <w:tcW w:type="dxa" w:w="2880"/>
+          </w:tcPr>
+          <w:p>
+            <w:r/>
+            <w:r>
+              <w:rPr>
+                <w:sz w:val="18"/>
+              </w:rPr>
+              <w:t>tables, orders, kitchen display</w:t>
+            </w:r>
+          </w:p>
+        </w:tc>
+        <w:tc>
+          <w:tcPr>
+            <w:tcW w:type="dxa" w:w="2304"/>
+          </w:tcPr>
+          <w:p>
+            <w:r/>
+            <w:r>
+              <w:rPr>
+                <w:sz w:val="18"/>
+              </w:rPr>
+              <w:t>Restaurants &amp; cafés</w:t>
+            </w:r>
+          </w:p>
+        </w:tc>
+      </w:tr>
+      <w:tr>
+        <w:tc>
+          <w:tcPr>
+            <w:tcW w:type="dxa" w:w="2016"/>
+          </w:tcPr>
+          <w:p>
+            <w:r/>
+            <w:r>
+              <w:rPr>
+                <w:sz w:val="18"/>
+              </w:rPr>
+              <w:t>Hotel</w:t>
+            </w:r>
+          </w:p>
+        </w:tc>
+        <w:tc>
+          <w:tcPr>
+            <w:tcW w:type="dxa" w:w="2448"/>
+          </w:tcPr>
+          <w:p>
+            <w:r/>
+            <w:r>
+              <w:rPr>
+                <w:sz w:val="18"/>
+              </w:rPr>
+              <w:t>accounting</w:t>
+            </w:r>
+          </w:p>
+        </w:tc>
+        <w:tc>
+          <w:tcPr>
+            <w:tcW w:type="dxa" w:w="2880"/>
+          </w:tcPr>
+          <w:p>
+            <w:r/>
+            <w:r>
+              <w:rPr>
+                <w:sz w:val="18"/>
+              </w:rPr>
+              <w:t>rooms, bookings</w:t>
+            </w:r>
+          </w:p>
+        </w:tc>
+        <w:tc>
+          <w:tcPr>
+            <w:tcW w:type="dxa" w:w="2304"/>
+          </w:tcPr>
+          <w:p>
+            <w:r/>
+            <w:r>
+              <w:rPr>
+                <w:sz w:val="18"/>
+              </w:rPr>
+              <w:t>Hotels / guesthouses</w:t>
+            </w:r>
+          </w:p>
+        </w:tc>
+      </w:tr>
+      <w:tr>
+        <w:tc>
+          <w:tcPr>
+            <w:tcW w:type="dxa" w:w="2016"/>
+          </w:tcPr>
+          <w:p>
+            <w:r/>
+            <w:r>
+              <w:rPr>
+                <w:sz w:val="18"/>
+              </w:rPr>
+              <w:t>Salon</w:t>
+            </w:r>
+          </w:p>
+        </w:tc>
+        <w:tc>
+          <w:tcPr>
+            <w:tcW w:type="dxa" w:w="2448"/>
+          </w:tcPr>
+          <w:p>
+            <w:r/>
+            <w:r>
+              <w:rPr>
+                <w:sz w:val="18"/>
+              </w:rPr>
+              <w:t>sales, accounting</w:t>
+            </w:r>
+          </w:p>
+        </w:tc>
+        <w:tc>
+          <w:tcPr>
+            <w:tcW w:type="dxa" w:w="2880"/>
+          </w:tcPr>
+          <w:p>
+            <w:r/>
+            <w:r>
+              <w:rPr>
+                <w:sz w:val="18"/>
+              </w:rPr>
+              <w:t>appointments, tickets, services</w:t>
+            </w:r>
+          </w:p>
+        </w:tc>
+        <w:tc>
+          <w:tcPr>
+            <w:tcW w:type="dxa" w:w="2304"/>
+          </w:tcPr>
+          <w:p>
+            <w:r/>
+            <w:r>
+              <w:rPr>
+                <w:sz w:val="18"/>
+              </w:rPr>
+              <w:t>Salons &amp; spas</w:t>
+            </w:r>
+          </w:p>
+        </w:tc>
+      </w:tr>
+      <w:tr>
+        <w:tc>
+          <w:tcPr>
+            <w:tcW w:type="dxa" w:w="2016"/>
+          </w:tcPr>
+          <w:p>
+            <w:r/>
+            <w:r>
+              <w:rPr>
+                <w:sz w:val="18"/>
+              </w:rPr>
+              <w:t>Laundry</w:t>
+            </w:r>
+          </w:p>
+        </w:tc>
+        <w:tc>
+          <w:tcPr>
+            <w:tcW w:type="dxa" w:w="2448"/>
+          </w:tcPr>
+          <w:p>
+            <w:r/>
+            <w:r>
+              <w:rPr>
+                <w:sz w:val="18"/>
+              </w:rPr>
+              <w:t>sales, accounting</w:t>
+            </w:r>
+          </w:p>
+        </w:tc>
+        <w:tc>
+          <w:tcPr>
+            <w:tcW w:type="dxa" w:w="2880"/>
+          </w:tcPr>
+          <w:p>
+            <w:r/>
+            <w:r>
+              <w:rPr>
+                <w:sz w:val="18"/>
+              </w:rPr>
+              <w:t>orders, services</w:t>
+            </w:r>
+          </w:p>
+        </w:tc>
+        <w:tc>
+          <w:tcPr>
+            <w:tcW w:type="dxa" w:w="2304"/>
+          </w:tcPr>
+          <w:p>
+            <w:r/>
+            <w:r>
+              <w:rPr>
+                <w:sz w:val="18"/>
+              </w:rPr>
+              <w:t>Laundries / dry cleaners</w:t>
+            </w:r>
+          </w:p>
+        </w:tc>
+      </w:tr>
+      <w:tr>
+        <w:tc>
+          <w:tcPr>
+            <w:tcW w:type="dxa" w:w="2016"/>
+          </w:tcPr>
+          <w:p>
+            <w:r/>
+            <w:r>
+              <w:rPr>
+                <w:sz w:val="18"/>
+              </w:rPr>
+              <w:t>Fashion</w:t>
+            </w:r>
+          </w:p>
+        </w:tc>
+        <w:tc>
+          <w:tcPr>
+            <w:tcW w:type="dxa" w:w="2448"/>
+          </w:tcPr>
+          <w:p>
+            <w:r/>
+            <w:r>
+              <w:rPr>
+                <w:sz w:val="18"/>
+              </w:rPr>
+              <w:t>sales, inventory</w:t>
+            </w:r>
+          </w:p>
+        </w:tc>
+        <w:tc>
+          <w:tcPr>
+            <w:tcW w:type="dxa" w:w="2880"/>
+          </w:tcPr>
+          <w:p>
+            <w:r/>
+            <w:r>
+              <w:rPr>
+                <w:sz w:val="18"/>
+              </w:rPr>
+              <w:t>variants, fashion POS, installments, cash box, store reports</w:t>
+            </w:r>
+          </w:p>
+        </w:tc>
+        <w:tc>
+          <w:tcPr>
+            <w:tcW w:type="dxa" w:w="2304"/>
+          </w:tcPr>
+          <w:p>
+            <w:r/>
+            <w:r>
+              <w:rPr>
+                <w:sz w:val="18"/>
+              </w:rPr>
+              <w:t>Clothing &amp; footwear retail</w:t>
+            </w:r>
+          </w:p>
+        </w:tc>
+      </w:tr>
+      <w:tr>
+        <w:tc>
+          <w:tcPr>
+            <w:tcW w:type="dxa" w:w="2016"/>
+          </w:tcPr>
+          <w:p>
+            <w:r/>
+            <w:r>
+              <w:rPr>
+                <w:sz w:val="18"/>
+              </w:rPr>
+              <w:t>Retail (general)</w:t>
+            </w:r>
+          </w:p>
+        </w:tc>
+        <w:tc>
+          <w:tcPr>
+            <w:tcW w:type="dxa" w:w="2448"/>
+          </w:tcPr>
+          <w:p>
+            <w:r/>
+            <w:r>
+              <w:rPr>
+                <w:sz w:val="18"/>
+              </w:rPr>
+              <w:t>sales, inventory, accounting, pos</w:t>
+            </w:r>
+          </w:p>
+        </w:tc>
+        <w:tc>
+          <w:tcPr>
+            <w:tcW w:type="dxa" w:w="2880"/>
+          </w:tcPr>
+          <w:p>
+            <w:r/>
+            <w:r>
+              <w:rPr>
+                <w:sz w:val="18"/>
+              </w:rPr>
+              <w:t>generic counter POS</w:t>
+            </w:r>
+          </w:p>
+        </w:tc>
+        <w:tc>
+          <w:tcPr>
+            <w:tcW w:type="dxa" w:w="2304"/>
+          </w:tcPr>
+          <w:p>
+            <w:r/>
+            <w:r>
+              <w:rPr>
+                <w:sz w:val="18"/>
+              </w:rPr>
+              <w:t>General retail shops</w:t>
+            </w:r>
+          </w:p>
+        </w:tc>
+      </w:tr>
+      <w:tr>
+        <w:tc>
+          <w:tcPr>
+            <w:tcW w:type="dxa" w:w="2016"/>
+          </w:tcPr>
+          <w:p>
+            <w:r/>
+            <w:r>
+              <w:rPr>
+                <w:sz w:val="18"/>
+              </w:rPr>
+              <w:t>Wholesale</w:t>
+            </w:r>
+          </w:p>
+        </w:tc>
+        <w:tc>
+          <w:tcPr>
+            <w:tcW w:type="dxa" w:w="2448"/>
+          </w:tcPr>
+          <w:p>
+            <w:r/>
+            <w:r>
+              <w:rPr>
+                <w:sz w:val="18"/>
+              </w:rPr>
+              <w:t>sales, inventory</w:t>
+            </w:r>
+          </w:p>
+        </w:tc>
+        <w:tc>
+          <w:tcPr>
+            <w:tcW w:type="dxa" w:w="2880"/>
+          </w:tcPr>
+          <w:p>
+            <w:r/>
+            <w:r>
+              <w:rPr>
+                <w:sz w:val="18"/>
+              </w:rPr>
+              <w:t>price tiers, wholesale orders</w:t>
+            </w:r>
+          </w:p>
+        </w:tc>
+        <w:tc>
+          <w:tcPr>
+            <w:tcW w:type="dxa" w:w="2304"/>
+          </w:tcPr>
+          <w:p>
+            <w:r/>
+            <w:r>
+              <w:rPr>
+                <w:sz w:val="18"/>
+              </w:rPr>
+              <w:t>Wholesalers / B2B sellers</w:t>
+            </w:r>
+          </w:p>
+        </w:tc>
+      </w:tr>
+    </w:tbl>
+    <w:p/>
+    <w:p>
+      <w:r>
+        <w:br w:type="page"/>
+      </w:r>
+    </w:p>
+    <w:p>
+      <w:pPr>
+        <w:pStyle w:val="Heading1"/>
+      </w:pPr>
+      <w:r>
+        <w:t>26. Final Architecture Readiness Assessment</w:t>
+      </w:r>
+    </w:p>
+    <w:p>
+      <w:pPr>
+        <w:jc w:val="center"/>
+      </w:pPr>
+      <w:r>
+        <w:drawing>
+          <wp:inline xmlns:a="http://schemas.openxmlformats.org/drawingml/2006/main" xmlns:pic="http://schemas.openxmlformats.org/drawingml/2006/picture">
+            <wp:extent cx="5394960" cy="2693239"/>
+            <wp:docPr id="5" name="Picture 5"/>
+            <wp:cNvGraphicFramePr>
+              <a:graphicFrameLocks noChangeAspect="1"/>
+            </wp:cNvGraphicFramePr>
+            <a:graphic>
+              <a:graphicData uri="http://schemas.openxmlformats.org/drawingml/2006/picture">
+                <pic:pic>
+                  <pic:nvPicPr>
+                    <pic:cNvPr id="0" name="scores.png"/>
+                    <pic:cNvPicPr/>
+                  </pic:nvPicPr>
+                  <pic:blipFill>
+                    <a:blip r:embed="rId13"/>
+                    <a:stretch>
+                      <a:fillRect/>
+                    </a:stretch>
+                  </pic:blipFill>
+                  <pic:spPr>
+                    <a:xfrm>
+                      <a:off x="0" y="0"/>
+                      <a:ext cx="5394960" cy="2693239"/>
+                    </a:xfrm>
+                    <a:prstGeom prst="rect"/>
+                  </pic:spPr>
+                </pic:pic>
+              </a:graphicData>
+            </a:graphic>
+          </wp:inline>
+        </w:drawing>
+      </w:r>
+    </w:p>
+    <w:p>
+      <w:pPr>
+        <w:jc w:val="center"/>
+      </w:pPr>
+      <w:r>
+        <w:rPr>
+          <w:i/>
+          <w:color w:val="666666"/>
+          <w:sz w:val="17"/>
+        </w:rPr>
+        <w:t>Figure 5 — Architecture readiness scores (out of 10).</w:t>
+      </w:r>
+    </w:p>
+    <w:p/>
+    <w:tbl>
+      <w:tblPr>
+        <w:tblStyle w:val="TableGrid"/>
+        <w:tblW w:type="auto" w:w="0"/>
+        <w:jc w:val="center"/>
+        <w:tblLook w:firstColumn="1" w:firstRow="1" w:lastColumn="0" w:lastRow="0" w:noHBand="0" w:noVBand="1" w:val="04A0"/>
+      </w:tblPr>
+      <w:tblGrid>
+        <w:gridCol w:w="2880"/>
+        <w:gridCol w:w="2880"/>
+        <w:gridCol w:w="2880"/>
+      </w:tblGrid>
+      <w:tr>
+        <w:tc>
+          <w:tcPr>
+            <w:tcW w:type="dxa" w:w="2736"/>
+            <w:shd w:val="clear" w:fill="1F3A5F"/>
+          </w:tcPr>
+          <w:p>
+            <w:r/>
+            <w:r>
+              <w:rPr>
+                <w:b/>
+                <w:color w:val="FFFFFF"/>
+                <w:sz w:val="19"/>
+              </w:rPr>
+              <w:t>Dimension</w:t>
+            </w:r>
+          </w:p>
+        </w:tc>
+        <w:tc>
+          <w:tcPr>
+            <w:tcW w:type="dxa" w:w="1440"/>
+            <w:shd w:val="clear" w:fill="1F3A5F"/>
+          </w:tcPr>
+          <w:p>
+            <w:r/>
+            <w:r>
+              <w:rPr>
+                <w:b/>
+                <w:color w:val="FFFFFF"/>
+                <w:sz w:val="19"/>
+              </w:rPr>
+              <w:t>Score</w:t>
+            </w:r>
+          </w:p>
+        </w:tc>
+        <w:tc>
+          <w:tcPr>
+            <w:tcW w:type="dxa" w:w="5184"/>
+            <w:shd w:val="clear" w:fill="1F3A5F"/>
+          </w:tcPr>
+          <w:p>
+            <w:r/>
+            <w:r>
+              <w:rPr>
+                <w:b/>
+                <w:color w:val="FFFFFF"/>
+                <w:sz w:val="19"/>
+              </w:rPr>
+              <w:t>Basis</w:t>
+            </w:r>
+          </w:p>
+        </w:tc>
+      </w:tr>
+      <w:tr>
+        <w:tc>
+          <w:tcPr>
+            <w:tcW w:type="dxa" w:w="2736"/>
+          </w:tcPr>
+          <w:p>
+            <w:r/>
+            <w:r>
+              <w:rPr>
+                <w:sz w:val="18"/>
+              </w:rPr>
+              <w:t>Security</w:t>
+            </w:r>
+          </w:p>
+        </w:tc>
+        <w:tc>
+          <w:tcPr>
+            <w:tcW w:type="dxa" w:w="1440"/>
+          </w:tcPr>
+          <w:p>
+            <w:r/>
+            <w:r>
+              <w:rPr>
+                <w:sz w:val="18"/>
+              </w:rPr>
+              <w:t>9.0 / 10</w:t>
+            </w:r>
+          </w:p>
+        </w:tc>
+        <w:tc>
+          <w:tcPr>
+            <w:tcW w:type="dxa" w:w="5184"/>
+          </w:tcPr>
+          <w:p>
+            <w:r/>
+            <w:r>
+              <w:rPr>
+                <w:sz w:val="18"/>
+              </w:rPr>
+              <w:t>RLS on all 129 tables; isolation verified (reads + writes); one historical leak fixed; guards consistent across the apex tier.</w:t>
+            </w:r>
+          </w:p>
+        </w:tc>
+      </w:tr>
+      <w:tr>
+        <w:tc>
+          <w:tcPr>
+            <w:tcW w:type="dxa" w:w="2736"/>
+          </w:tcPr>
+          <w:p>
+            <w:r/>
+            <w:r>
+              <w:rPr>
+                <w:sz w:val="18"/>
+              </w:rPr>
+              <w:t>Tenant Isolation</w:t>
+            </w:r>
+          </w:p>
+        </w:tc>
+        <w:tc>
+          <w:tcPr>
+            <w:tcW w:type="dxa" w:w="1440"/>
+          </w:tcPr>
+          <w:p>
+            <w:r/>
+            <w:r>
+              <w:rPr>
+                <w:sz w:val="18"/>
+              </w:rPr>
+              <w:t>9.0 / 10</w:t>
+            </w:r>
+          </w:p>
+        </w:tc>
+        <w:tc>
+          <w:tcPr>
+            <w:tcW w:type="dxa" w:w="5184"/>
+          </w:tcPr>
+          <w:p>
+            <w:r/>
+            <w:r>
+              <w:rPr>
+                <w:sz w:val="18"/>
+              </w:rPr>
+              <w:t>company_id scoping everywhere; no permissive tenant policies; sensitive tables (audit/billing/staff) tightly scoped.</w:t>
+            </w:r>
+          </w:p>
+        </w:tc>
+      </w:tr>
+      <w:tr>
+        <w:tc>
+          <w:tcPr>
+            <w:tcW w:type="dxa" w:w="2736"/>
+          </w:tcPr>
+          <w:p>
+            <w:r/>
+            <w:r>
+              <w:rPr>
+                <w:sz w:val="18"/>
+              </w:rPr>
+              <w:t>Governance</w:t>
+            </w:r>
+          </w:p>
+        </w:tc>
+        <w:tc>
+          <w:tcPr>
+            <w:tcW w:type="dxa" w:w="1440"/>
+          </w:tcPr>
+          <w:p>
+            <w:r/>
+            <w:r>
+              <w:rPr>
+                <w:sz w:val="18"/>
+              </w:rPr>
+              <w:t>9.0 / 10</w:t>
+            </w:r>
+          </w:p>
+        </w:tc>
+        <w:tc>
+          <w:tcPr>
+            <w:tcW w:type="dxa" w:w="5184"/>
+          </w:tcPr>
+          <w:p>
+            <w:r/>
+            <w:r>
+              <w:rPr>
+                <w:sz w:val="18"/>
+              </w:rPr>
+              <w:t>Unified authorization; all sensitive mutations audited; tenant + vendor audit viewers; CI architecture/authz/schema guards.</w:t>
+            </w:r>
+          </w:p>
+        </w:tc>
+      </w:tr>
+      <w:tr>
+        <w:tc>
+          <w:tcPr>
+            <w:tcW w:type="dxa" w:w="2736"/>
+          </w:tcPr>
+          <w:p>
+            <w:r/>
+            <w:r>
+              <w:rPr>
+                <w:sz w:val="18"/>
+              </w:rPr>
+              <w:t>Maintainability</w:t>
+            </w:r>
+          </w:p>
+        </w:tc>
+        <w:tc>
+          <w:tcPr>
+            <w:tcW w:type="dxa" w:w="1440"/>
+          </w:tcPr>
+          <w:p>
+            <w:r/>
+            <w:r>
+              <w:rPr>
+                <w:sz w:val="18"/>
+              </w:rPr>
+              <w:t>8.0 / 10</w:t>
+            </w:r>
+          </w:p>
+        </w:tc>
+        <w:tc>
+          <w:tcPr>
+            <w:tcW w:type="dxa" w:w="5184"/>
+          </w:tcPr>
+          <w:p>
+            <w:r/>
+            <w:r>
+              <w:rPr>
+                <w:sz w:val="18"/>
+              </w:rPr>
+              <w:t>Shared gating helpers; typed catalogs; thorough docs; minor naming debt remains.</w:t>
+            </w:r>
+          </w:p>
+        </w:tc>
+      </w:tr>
+      <w:tr>
+        <w:tc>
+          <w:tcPr>
+            <w:tcW w:type="dxa" w:w="2736"/>
+          </w:tcPr>
+          <w:p>
+            <w:r/>
+            <w:r>
+              <w:rPr>
+                <w:sz w:val="18"/>
+              </w:rPr>
+              <w:t>Production Readiness</w:t>
+            </w:r>
+          </w:p>
+        </w:tc>
+        <w:tc>
+          <w:tcPr>
+            <w:tcW w:type="dxa" w:w="1440"/>
+          </w:tcPr>
+          <w:p>
+            <w:r/>
+            <w:r>
+              <w:rPr>
+                <w:sz w:val="18"/>
+              </w:rPr>
+              <w:t>8.5 / 10</w:t>
+            </w:r>
+          </w:p>
+        </w:tc>
+        <w:tc>
+          <w:tcPr>
+            <w:tcW w:type="dxa" w:w="5184"/>
+          </w:tcPr>
+          <w:p>
+            <w:r/>
+            <w:r>
+              <w:rPr>
+                <w:sz w:val="18"/>
+              </w:rPr>
+              <w:t>Green CI; migrations apply cleanly to staging; clean two-PR split; reversible migrations.</w:t>
+            </w:r>
+          </w:p>
+        </w:tc>
+      </w:tr>
+      <w:tr>
+        <w:tc>
+          <w:tcPr>
+            <w:tcW w:type="dxa" w:w="2736"/>
+          </w:tcPr>
+          <w:p>
+            <w:r/>
+            <w:r>
+              <w:rPr>
+                <w:sz w:val="18"/>
+              </w:rPr>
+              <w:t>Scalability</w:t>
+            </w:r>
+          </w:p>
+        </w:tc>
+        <w:tc>
+          <w:tcPr>
+            <w:tcW w:type="dxa" w:w="1440"/>
+          </w:tcPr>
+          <w:p>
+            <w:r/>
+            <w:r>
+              <w:rPr>
+                <w:sz w:val="18"/>
+              </w:rPr>
+              <w:t>7.5 / 10</w:t>
+            </w:r>
+          </w:p>
+        </w:tc>
+        <w:tc>
+          <w:tcPr>
+            <w:tcW w:type="dxa" w:w="5184"/>
+          </w:tcPr>
+          <w:p>
+            <w:r/>
+            <w:r>
+              <w:rPr>
+                <w:sz w:val="18"/>
+              </w:rPr>
+              <w:t>FK coverage 100%, per-query RLS, request memoization done; partitioning/rollups/replica deferred (trigger-based).</w:t>
+            </w:r>
+          </w:p>
+        </w:tc>
+      </w:tr>
+      <w:tr>
+        <w:tc>
+          <w:tcPr>
+            <w:tcW w:type="dxa" w:w="2736"/>
+          </w:tcPr>
+          <w:p>
+            <w:r/>
+            <w:r>
+              <w:rPr>
+                <w:sz w:val="18"/>
+              </w:rPr>
+              <w:t>Current Maturity (overall)</w:t>
+            </w:r>
+          </w:p>
+        </w:tc>
+        <w:tc>
+          <w:tcPr>
+            <w:tcW w:type="dxa" w:w="1440"/>
+          </w:tcPr>
+          <w:p>
+            <w:r/>
+            <w:r>
+              <w:rPr>
+                <w:sz w:val="18"/>
+              </w:rPr>
+              <w:t>8.5 / 10</w:t>
+            </w:r>
+          </w:p>
+        </w:tc>
+        <w:tc>
+          <w:tcPr>
+            <w:tcW w:type="dxa" w:w="5184"/>
+          </w:tcPr>
+          <w:p>
+            <w:r/>
+            <w:r>
+              <w:rPr>
+                <w:sz w:val="18"/>
+              </w:rPr>
+              <w:t>Production-grade core; remaining work is the customer-facing product surface + trigger-based scale.</w:t>
+            </w:r>
+          </w:p>
+        </w:tc>
+      </w:tr>
+    </w:tbl>
+    <w:p/>
+    <w:p>
+      <w:r>
+        <w:br w:type="page"/>
+      </w:r>
+    </w:p>
+    <w:p>
+      <w:pPr>
+        <w:pStyle w:val="Heading1"/>
+      </w:pPr>
+      <w:r>
+        <w:t>27. Executive CTO Summary</w:t>
+      </w:r>
+    </w:p>
+    <w:p>
+      <w:r>
+        <w:rPr>
+          <w:b/>
+          <w:i w:val="0"/>
+        </w:rPr>
+        <w:t>What VANTORA is.</w:t>
+      </w:r>
+    </w:p>
+    <w:p>
+      <w:r>
+        <w:rPr>
+          <w:b w:val="0"/>
+          <w:i w:val="0"/>
+        </w:rPr>
+        <w:t>A production-grade, multi-tenant SaaS ERP that runs many businesses of different industries from a single codebase and database, with strict per-tenant isolation, a five-layer entitlement model (Plan → Module → Permission → UI → Guard), and a vendor control center for administering the whole platform. Built on Next.js (App Router) and Supabase (Postgres + RLS + Auth + Storage).</w:t>
+      </w:r>
+    </w:p>
+    <w:p>
+      <w:r>
+        <w:rPr>
+          <w:b/>
+          <w:i w:val="0"/>
+        </w:rPr>
+        <w:t>What is already complete.</w:t>
+      </w:r>
+    </w:p>
+    <w:p>
+      <w:pPr>
+        <w:pStyle w:val="ListBullet"/>
+      </w:pPr>
+      <w:r>
+        <w:t>Authorization &amp; isolation: RLS on all 129 tables, verified for reads and writes; consistent apex tier; every sensitive mutation audited; tenant and vendor audit viewers.</w:t>
+      </w:r>
+    </w:p>
+    <w:p>
+      <w:pPr>
+        <w:pStyle w:val="ListBullet"/>
+      </w:pPr>
+      <w:r>
+        <w:t>Platform control center: company 360 (suspend/activate, plan/trial, modules, users), Plans &amp; Modules editor (with impact preview), Global Roles &amp; Permissions, View-As-Company, billing, staff, audit.</w:t>
+      </w:r>
+    </w:p>
+    <w:p>
+      <w:pPr>
+        <w:pStyle w:val="ListBullet"/>
+      </w:pPr>
+      <w:r>
+        <w:t>Tenant experiences: clean, business-type-specific navigation for fashion, clinic, restaurant, pharmacy, salon, laundry, hotel, wholesale, FMCG distribution, and general retail.</w:t>
+      </w:r>
+    </w:p>
+    <w:p>
+      <w:pPr>
+        <w:pStyle w:val="ListBullet"/>
+      </w:pPr>
+      <w:r>
+        <w:t>Entitlement consistency: every licensable module has a navigation surface; integrations and POS are real plan-gated capabilities; clothing normalized to fashion-only.</w:t>
+      </w:r>
+    </w:p>
+    <w:p>
+      <w:pPr>
+        <w:pStyle w:val="ListBullet"/>
+      </w:pPr>
+      <w:r>
+        <w:t>Scalability foundations: 100% FK index coverage, per-query RLS auth, request-memoized auth context, and a CI schema-health guard.</w:t>
+      </w:r>
+    </w:p>
+    <w:p>
+      <w:pPr>
+        <w:pStyle w:val="ListBullet"/>
+      </w:pPr>
+      <w:r>
+        <w:t>Documentation + a clean two-PR split (#121 Fashion, #122 Governance) that preserves all history.</w:t>
+      </w:r>
+    </w:p>
+    <w:p>
+      <w:r>
+        <w:rPr>
+          <w:b/>
+          <w:i w:val="0"/>
+        </w:rPr>
+        <w:t>What remains.</w:t>
+      </w:r>
+    </w:p>
+    <w:p>
+      <w:pPr>
+        <w:pStyle w:val="ListBullet"/>
+      </w:pPr>
+      <w:r>
+        <w:t>Trigger-based scale work: (company_id, created_at) composite indexes, retention policies, monthly range-partitioning of high-volume tables, platform-analytics rollups, and a read replica.</w:t>
+      </w:r>
+    </w:p>
+    <w:p>
+      <w:pPr>
+        <w:pStyle w:val="ListBullet"/>
+      </w:pPr>
+      <w:r>
+        <w:t>A deliberate naming-reconciliation pass (finance↔accounting; market labeled "Supermarket").</w:t>
+      </w:r>
+    </w:p>
+    <w:p>
+      <w:pPr>
+        <w:pStyle w:val="ListBullet"/>
+      </w:pPr>
+      <w:r>
+        <w:t>Minor cleanups: move copilot-analytics out of the vendor namespace; finalize field_ops / POS defaults per business type.</w:t>
+      </w:r>
+    </w:p>
+    <w:p>
+      <w:pPr>
+        <w:pStyle w:val="ListBullet"/>
+      </w:pPr>
+      <w:r>
+        <w:t>Customer-facing product surface: self-serve plan/upgrade flows and tenant dashboards.</w:t>
+      </w:r>
+    </w:p>
+    <w:p>
+      <w:r>
+        <w:rPr>
+          <w:b/>
+          <w:i w:val="0"/>
+        </w:rPr>
+        <w:t>What should be built next.</w:t>
+      </w:r>
+    </w:p>
+    <w:p>
+      <w:pPr>
+        <w:pStyle w:val="ListBullet"/>
+      </w:pPr>
+      <w:r>
+        <w:t>Land #121 then #122 to main; confirm the Supabase transaction pooler for serverless connections.</w:t>
+      </w:r>
+    </w:p>
+    <w:p>
+      <w:pPr>
+        <w:pStyle w:val="ListBullet"/>
+      </w:pPr>
+      <w:r>
+        <w:t>Catalog (plans/roles/modules) short-TTL caching; the naming pass; per-vertical default finalization.</w:t>
+      </w:r>
+    </w:p>
+    <w:p>
+      <w:pPr>
+        <w:pStyle w:val="ListBullet"/>
+      </w:pPr>
+      <w:r>
+        <w:t>Begin the customer-facing self-serve plan/upgrade experience on top of the entitlement model.</w:t>
+      </w:r>
+    </w:p>
+    <w:p>
+      <w:r>
+        <w:rPr>
+          <w:b/>
+          <w:i w:val="0"/>
+        </w:rPr>
+        <w:t>Required before onboarding paying customers.</w:t>
+      </w:r>
+    </w:p>
+    <w:p>
+      <w:pPr>
+        <w:pStyle w:val="ListBullet"/>
+      </w:pPr>
+      <w:r>
+        <w:t>Confirm production connection pooling (transaction pooler) and backup/PITR posture.</w:t>
+      </w:r>
+    </w:p>
+    <w:p>
+      <w:pPr>
+        <w:pStyle w:val="ListBullet"/>
+      </w:pPr>
+      <w:r>
+        <w:t>Define and enable retention for audit logs and notifications (legal + growth).</w:t>
+      </w:r>
+    </w:p>
+    <w:p>
+      <w:pPr>
+        <w:pStyle w:val="ListBullet"/>
+      </w:pPr>
+      <w:r>
+        <w:t>End-to-end validation of billing/subscription flows.</w:t>
+      </w:r>
+    </w:p>
+    <w:p>
+      <w:pPr>
+        <w:pStyle w:val="ListBullet"/>
+      </w:pPr>
+      <w:r>
+        <w:t>A final security pass and a load smoke-test at expected pilot volume.</w:t>
+      </w:r>
+    </w:p>
+    <w:p>
+      <w:pPr>
+        <w:pStyle w:val="ListBullet"/>
+      </w:pPr>
+      <w:r>
+        <w:t>Support and incident runbooks; on-call and monitoring in place.</w:t>
+      </w:r>
+    </w:p>
     <w:p/>
     <w:p>
       <w:pPr>

</xml_diff>